<commit_message>
style: dinh dang lai mau Bien Ban/GCN (TEMPLATE_FREQ, TEMPLATE_POWER)
Ap dung tren nen code moi nhat tu dong nghiep (sau khi lay ve origin/main,
bao gom cac sua doi noi dung nhu "KET QUA KIEM DINH" -> "KET QUA HIEU
CHUAN" va dong ngay ky chuyen sang tag {{ header.sign_date }}).

Theo yeu cau khach hang: mau qua don gian, chua duoc dinh dang. Chi doi
font/co chu/dam/nghieng/can le/vien bang/to nen - KHONG doi 1 ky tu noi
dung nao (ca tag Jinja {{ }}/{% %}/{%tr %}), da verify bang so sanh text
trich xuat truoc/sau giong het 100% va render thu bang docxtpl thanh cong.

Phong cach don sac co dien (den/xam, khong mau) theo lua chon cua khach
hang: Times New Roman toan bo, tieu de dam can giua, nhan dam/gia tri
thuong, tieu de muc dam phan cap, bang du lieu tieu de to nen xam nhat +
dam + vien manh dong nhat, bang chu ky can giua.

Script dinh dang luu o scripts/format_report_templates.py de tai su dung
neu sau nay co mau noi dung moi.
</commit_message>
<xml_diff>
--- a/templates/TEMPLATE_FREQ/gcnkd.docx
+++ b/templates/TEMPLATE_FREQ/gcnkd.docx
@@ -18,6 +18,10 @@
           </w:tcPr>
           <w:p>
             <w:r>
+              <w:rPr>
+                <w:rFonts w:ascii="Times New Roman" w:hAnsi="Times New Roman" w:eastAsia="Times New Roman"/>
+                <w:sz w:val="22"/>
+              </w:rPr>
               <w:t>CỤC TIÊU CHUẨN ĐO LƯỜNG-CHẤT LƯỢNG / TRUNG TÂM TIÊU CHUẨN ĐO LƯỜNG-CHẤT LƯỢNG 2</w:t>
             </w:r>
           </w:p>
@@ -27,7 +31,15 @@
             <w:tcW w:type="dxa" w:w="4320"/>
           </w:tcPr>
           <w:p>
+            <w:pPr>
+              <w:jc w:val="center"/>
+            </w:pPr>
             <w:r>
+              <w:rPr>
+                <w:rFonts w:ascii="Times New Roman" w:hAnsi="Times New Roman" w:eastAsia="Times New Roman"/>
+                <w:b/>
+                <w:sz w:val="19"/>
+              </w:rPr>
               <w:t>CỘNG HÒA XÃ HỘI CHỦ NGHĨA VIỆT NAM / Độc lập - Tự do - Hạnh phúc</w:t>
             </w:r>
           </w:p>
@@ -36,52 +48,193 @@
     </w:tbl>
     <w:p>
       <w:r>
+        <w:rPr>
+          <w:rFonts w:ascii="Times New Roman" w:hAnsi="Times New Roman" w:eastAsia="Times New Roman"/>
+          <w:b w:val="0"/>
+          <w:sz w:val="26"/>
+        </w:rPr>
         <w:t>{{ header.today }}</w:t>
       </w:r>
     </w:p>
     <w:p>
+      <w:pPr>
+        <w:spacing w:after="80"/>
+        <w:jc w:val="center"/>
+      </w:pPr>
       <w:r>
+        <w:rPr>
+          <w:rFonts w:ascii="Times New Roman" w:hAnsi="Times New Roman" w:eastAsia="Times New Roman"/>
+          <w:b/>
+          <w:sz w:val="32"/>
+        </w:rPr>
         <w:t>GIẤY CHỨNG NHẬN KIỂM ĐỊNH</w:t>
       </w:r>
     </w:p>
     <w:p>
       <w:r>
-        <w:t>Số: {{ header.cert_no }}</w:t>
+        <w:rPr>
+          <w:rFonts w:ascii="Times New Roman" w:hAnsi="Times New Roman" w:eastAsia="Times New Roman"/>
+          <w:b/>
+          <w:sz w:val="26"/>
+        </w:rPr>
+        <w:t xml:space="preserve">Số: </w:t>
+      </w:r>
+      <w:r>
+        <w:rPr>
+          <w:rFonts w:ascii="Times New Roman" w:hAnsi="Times New Roman" w:eastAsia="Times New Roman"/>
+          <w:b w:val="0"/>
+          <w:sz w:val="26"/>
+        </w:rPr>
+        <w:t>{{ header.cert_no }}</w:t>
       </w:r>
     </w:p>
     <w:p>
       <w:r>
-        <w:t>Tên phương tiện ĐL-TN: {{ header.name }}</w:t>
+        <w:rPr>
+          <w:rFonts w:ascii="Times New Roman" w:hAnsi="Times New Roman" w:eastAsia="Times New Roman"/>
+          <w:b/>
+          <w:sz w:val="26"/>
+        </w:rPr>
+        <w:t xml:space="preserve">Tên phương tiện ĐL-TN: </w:t>
+      </w:r>
+      <w:r>
+        <w:rPr>
+          <w:rFonts w:ascii="Times New Roman" w:hAnsi="Times New Roman" w:eastAsia="Times New Roman"/>
+          <w:b w:val="0"/>
+          <w:sz w:val="26"/>
+        </w:rPr>
+        <w:t>{{ header.name }}</w:t>
       </w:r>
     </w:p>
     <w:p>
       <w:r>
-        <w:t>Ký hiệu: {{ header.no }}          Số hiệu: {{ header.serial }}</w:t>
+        <w:rPr>
+          <w:rFonts w:ascii="Times New Roman" w:hAnsi="Times New Roman" w:eastAsia="Times New Roman"/>
+          <w:b/>
+          <w:sz w:val="26"/>
+        </w:rPr>
+        <w:t xml:space="preserve">Ký hiệu: </w:t>
+      </w:r>
+      <w:r>
+        <w:rPr>
+          <w:rFonts w:ascii="Times New Roman" w:hAnsi="Times New Roman" w:eastAsia="Times New Roman"/>
+          <w:b w:val="0"/>
+          <w:sz w:val="26"/>
+        </w:rPr>
+        <w:t>{{ header.no }}</w:t>
+      </w:r>
+      <w:r>
+        <w:rPr>
+          <w:rFonts w:ascii="Times New Roman" w:hAnsi="Times New Roman" w:eastAsia="Times New Roman"/>
+          <w:b/>
+          <w:sz w:val="26"/>
+        </w:rPr>
+        <w:t xml:space="preserve">          Số hiệu: </w:t>
+      </w:r>
+      <w:r>
+        <w:rPr>
+          <w:rFonts w:ascii="Times New Roman" w:hAnsi="Times New Roman" w:eastAsia="Times New Roman"/>
+          <w:b w:val="0"/>
+          <w:sz w:val="26"/>
+        </w:rPr>
+        <w:t>{{ header.serial }}</w:t>
       </w:r>
     </w:p>
     <w:p>
       <w:r>
-        <w:t>Nước (hãng) sản xuất: {{ header.country }}          Năm sản xuất: {{ header.birthday }}</w:t>
+        <w:rPr>
+          <w:rFonts w:ascii="Times New Roman" w:hAnsi="Times New Roman" w:eastAsia="Times New Roman"/>
+          <w:b/>
+          <w:sz w:val="26"/>
+        </w:rPr>
+        <w:t xml:space="preserve">Nước (hãng) sản xuất: </w:t>
+      </w:r>
+      <w:r>
+        <w:rPr>
+          <w:rFonts w:ascii="Times New Roman" w:hAnsi="Times New Roman" w:eastAsia="Times New Roman"/>
+          <w:b w:val="0"/>
+          <w:sz w:val="26"/>
+        </w:rPr>
+        <w:t>{{ header.country }}</w:t>
+      </w:r>
+      <w:r>
+        <w:rPr>
+          <w:rFonts w:ascii="Times New Roman" w:hAnsi="Times New Roman" w:eastAsia="Times New Roman"/>
+          <w:b/>
+          <w:sz w:val="26"/>
+        </w:rPr>
+        <w:t xml:space="preserve">          Năm sản xuất: </w:t>
+      </w:r>
+      <w:r>
+        <w:rPr>
+          <w:rFonts w:ascii="Times New Roman" w:hAnsi="Times New Roman" w:eastAsia="Times New Roman"/>
+          <w:b w:val="0"/>
+          <w:sz w:val="26"/>
+        </w:rPr>
+        <w:t>{{ header.birthday }}</w:t>
       </w:r>
     </w:p>
     <w:p>
       <w:r>
-        <w:t>Đơn vị sử dụng: {{ header.company }}</w:t>
+        <w:rPr>
+          <w:rFonts w:ascii="Times New Roman" w:hAnsi="Times New Roman" w:eastAsia="Times New Roman"/>
+          <w:b/>
+          <w:sz w:val="26"/>
+        </w:rPr>
+        <w:t xml:space="preserve">Đơn vị sử dụng: </w:t>
+      </w:r>
+      <w:r>
+        <w:rPr>
+          <w:rFonts w:ascii="Times New Roman" w:hAnsi="Times New Roman" w:eastAsia="Times New Roman"/>
+          <w:b w:val="0"/>
+          <w:sz w:val="26"/>
+        </w:rPr>
+        <w:t>{{ header.company }}</w:t>
       </w:r>
     </w:p>
     <w:p>
       <w:r>
-        <w:t>Đặc tính đo lường: Dải tần số đo từ {{ header.Characteristics }}.</w:t>
+        <w:rPr>
+          <w:rFonts w:ascii="Times New Roman" w:hAnsi="Times New Roman" w:eastAsia="Times New Roman"/>
+          <w:b/>
+          <w:sz w:val="26"/>
+        </w:rPr>
+        <w:t xml:space="preserve">Đặc tính đo lường: Dải tần số đo từ </w:t>
+      </w:r>
+      <w:r>
+        <w:rPr>
+          <w:rFonts w:ascii="Times New Roman" w:hAnsi="Times New Roman" w:eastAsia="Times New Roman"/>
+          <w:b w:val="0"/>
+          <w:sz w:val="26"/>
+        </w:rPr>
+        <w:t>{{ header.Characteristics }}</w:t>
+      </w:r>
+      <w:r>
+        <w:rPr>
+          <w:rFonts w:ascii="Times New Roman" w:hAnsi="Times New Roman" w:eastAsia="Times New Roman"/>
+          <w:b/>
+          <w:sz w:val="26"/>
+        </w:rPr>
+        <w:t>.</w:t>
       </w:r>
     </w:p>
     <w:p>
+      <w:pPr>
+        <w:spacing w:before="160" w:after="80"/>
+      </w:pPr>
       <w:r>
+        <w:rPr>
+          <w:rFonts w:ascii="Times New Roman" w:hAnsi="Times New Roman" w:eastAsia="Times New Roman"/>
+          <w:b/>
+          <w:sz w:val="26"/>
+        </w:rPr>
         <w:t>KẾT QUẢ KIỂM ĐỊNH</w:t>
       </w:r>
     </w:p>
     <w:tbl>
       <w:tblPr>
         <w:tblW w:type="auto" w:w="0"/>
+        <w:jc w:val="center"/>
         <w:tblLook w:firstColumn="1" w:firstRow="1" w:lastColumn="0" w:lastRow="0" w:noHBand="0" w:noVBand="1" w:val="04A0"/>
       </w:tblPr>
       <w:tblGrid>
@@ -93,9 +246,25 @@
         <w:tc>
           <w:tcPr>
             <w:tcW w:type="dxa" w:w="2880"/>
+            <w:shd w:val="clear" w:color="auto" w:fill="F2F2F2"/>
+            <w:vAlign w:val="center"/>
+            <w:tcBorders>
+              <w:top w:val="single" w:sz="4" w:space="0" w:color="000000"/>
+              <w:start w:val="single" w:sz="4" w:space="0" w:color="000000"/>
+              <w:bottom w:val="single" w:sz="4" w:space="0" w:color="000000"/>
+              <w:end w:val="single" w:sz="4" w:space="0" w:color="000000"/>
+            </w:tcBorders>
           </w:tcPr>
           <w:p>
+            <w:pPr>
+              <w:jc w:val="center"/>
+            </w:pPr>
             <w:r>
+              <w:rPr>
+                <w:rFonts w:ascii="Times New Roman" w:hAnsi="Times New Roman" w:eastAsia="Times New Roman"/>
+                <w:b/>
+                <w:sz w:val="24"/>
+              </w:rPr>
               <w:t>THAM SỐ KIỂM ĐỊNH</w:t>
             </w:r>
           </w:p>
@@ -103,9 +272,25 @@
         <w:tc>
           <w:tcPr>
             <w:tcW w:type="dxa" w:w="2880"/>
+            <w:shd w:val="clear" w:color="auto" w:fill="F2F2F2"/>
+            <w:vAlign w:val="center"/>
+            <w:tcBorders>
+              <w:top w:val="single" w:sz="4" w:space="0" w:color="000000"/>
+              <w:start w:val="single" w:sz="4" w:space="0" w:color="000000"/>
+              <w:bottom w:val="single" w:sz="4" w:space="0" w:color="000000"/>
+              <w:end w:val="single" w:sz="4" w:space="0" w:color="000000"/>
+            </w:tcBorders>
           </w:tcPr>
           <w:p>
+            <w:pPr>
+              <w:jc w:val="center"/>
+            </w:pPr>
             <w:r>
+              <w:rPr>
+                <w:rFonts w:ascii="Times New Roman" w:hAnsi="Times New Roman" w:eastAsia="Times New Roman"/>
+                <w:b/>
+                <w:sz w:val="24"/>
+              </w:rPr>
               <w:t>KẾT QUẢ ĐO</w:t>
             </w:r>
           </w:p>
@@ -113,9 +298,25 @@
         <w:tc>
           <w:tcPr>
             <w:tcW w:type="dxa" w:w="2880"/>
+            <w:shd w:val="clear" w:color="auto" w:fill="F2F2F2"/>
+            <w:vAlign w:val="center"/>
+            <w:tcBorders>
+              <w:top w:val="single" w:sz="4" w:space="0" w:color="000000"/>
+              <w:start w:val="single" w:sz="4" w:space="0" w:color="000000"/>
+              <w:bottom w:val="single" w:sz="4" w:space="0" w:color="000000"/>
+              <w:end w:val="single" w:sz="4" w:space="0" w:color="000000"/>
+            </w:tcBorders>
           </w:tcPr>
           <w:p>
+            <w:pPr>
+              <w:jc w:val="center"/>
+            </w:pPr>
             <w:r>
+              <w:rPr>
+                <w:rFonts w:ascii="Times New Roman" w:hAnsi="Times New Roman" w:eastAsia="Times New Roman"/>
+                <w:b/>
+                <w:sz w:val="24"/>
+              </w:rPr>
               <w:t>GIÁ TRỊ CHO PHÉP</w:t>
             </w:r>
           </w:p>
@@ -125,9 +326,18 @@
         <w:tc>
           <w:tcPr>
             <w:tcW w:type="dxa" w:w="2880"/>
+            <w:vAlign w:val="center"/>
           </w:tcPr>
           <w:p>
+            <w:pPr>
+              <w:jc w:val="center"/>
+            </w:pPr>
             <w:r>
+              <w:rPr>
+                <w:rFonts w:ascii="Times New Roman" w:hAnsi="Times New Roman" w:eastAsia="Times New Roman"/>
+                <w:b w:val="0"/>
+                <w:sz w:val="24"/>
+              </w:rPr>
               <w:t>{%tr if tables.A1.enabled %}</w:t>
             </w:r>
           </w:p>
@@ -135,23 +345,48 @@
         <w:tc>
           <w:tcPr>
             <w:tcW w:type="dxa" w:w="2880"/>
+            <w:vAlign w:val="center"/>
           </w:tcPr>
-          <w:p/>
+          <w:p>
+            <w:pPr>
+              <w:jc w:val="center"/>
+            </w:pPr>
+          </w:p>
         </w:tc>
         <w:tc>
           <w:tcPr>
             <w:tcW w:type="dxa" w:w="2880"/>
+            <w:vAlign w:val="center"/>
           </w:tcPr>
-          <w:p/>
+          <w:p>
+            <w:pPr>
+              <w:jc w:val="center"/>
+            </w:pPr>
+          </w:p>
         </w:tc>
       </w:tr>
       <w:tr>
         <w:tc>
           <w:tcPr>
             <w:tcW w:type="dxa" w:w="2880"/>
+            <w:vAlign w:val="center"/>
+            <w:tcBorders>
+              <w:top w:val="single" w:sz="4" w:space="0" w:color="000000"/>
+              <w:start w:val="single" w:sz="4" w:space="0" w:color="000000"/>
+              <w:bottom w:val="single" w:sz="4" w:space="0" w:color="000000"/>
+              <w:end w:val="single" w:sz="4" w:space="0" w:color="000000"/>
+            </w:tcBorders>
           </w:tcPr>
           <w:p>
+            <w:pPr>
+              <w:jc w:val="center"/>
+            </w:pPr>
             <w:r>
+              <w:rPr>
+                <w:rFonts w:ascii="Times New Roman" w:hAnsi="Times New Roman" w:eastAsia="Times New Roman"/>
+                <w:b w:val="0"/>
+                <w:sz w:val="24"/>
+              </w:rPr>
               <w:t>1.Xác định sai số bộ dao động thạch anh</w:t>
             </w:r>
           </w:p>
@@ -159,9 +394,24 @@
         <w:tc>
           <w:tcPr>
             <w:tcW w:type="dxa" w:w="2880"/>
+            <w:vAlign w:val="center"/>
+            <w:tcBorders>
+              <w:top w:val="single" w:sz="4" w:space="0" w:color="000000"/>
+              <w:start w:val="single" w:sz="4" w:space="0" w:color="000000"/>
+              <w:bottom w:val="single" w:sz="4" w:space="0" w:color="000000"/>
+              <w:end w:val="single" w:sz="4" w:space="0" w:color="000000"/>
+            </w:tcBorders>
           </w:tcPr>
           <w:p>
+            <w:pPr>
+              <w:jc w:val="center"/>
+            </w:pPr>
             <w:r>
+              <w:rPr>
+                <w:rFonts w:ascii="Times New Roman" w:hAnsi="Times New Roman" w:eastAsia="Times New Roman"/>
+                <w:b w:val="0"/>
+                <w:sz w:val="24"/>
+              </w:rPr>
               <w:t>{{ tables.A1.result }}</w:t>
             </w:r>
           </w:p>
@@ -169,9 +419,24 @@
         <w:tc>
           <w:tcPr>
             <w:tcW w:type="dxa" w:w="2880"/>
+            <w:vAlign w:val="center"/>
+            <w:tcBorders>
+              <w:top w:val="single" w:sz="4" w:space="0" w:color="000000"/>
+              <w:start w:val="single" w:sz="4" w:space="0" w:color="000000"/>
+              <w:bottom w:val="single" w:sz="4" w:space="0" w:color="000000"/>
+              <w:end w:val="single" w:sz="4" w:space="0" w:color="000000"/>
+            </w:tcBorders>
           </w:tcPr>
           <w:p>
+            <w:pPr>
+              <w:jc w:val="center"/>
+            </w:pPr>
             <w:r>
+              <w:rPr>
+                <w:rFonts w:ascii="Times New Roman" w:hAnsi="Times New Roman" w:eastAsia="Times New Roman"/>
+                <w:b w:val="0"/>
+                <w:sz w:val="24"/>
+              </w:rPr>
               <w:t>± 2,4×10⁻⁷</w:t>
             </w:r>
           </w:p>
@@ -181,9 +446,18 @@
         <w:tc>
           <w:tcPr>
             <w:tcW w:type="dxa" w:w="2880"/>
+            <w:vAlign w:val="center"/>
           </w:tcPr>
           <w:p>
+            <w:pPr>
+              <w:jc w:val="center"/>
+            </w:pPr>
             <w:r>
+              <w:rPr>
+                <w:rFonts w:ascii="Times New Roman" w:hAnsi="Times New Roman" w:eastAsia="Times New Roman"/>
+                <w:b w:val="0"/>
+                <w:sz w:val="24"/>
+              </w:rPr>
               <w:t>{%tr endif %}</w:t>
             </w:r>
           </w:p>
@@ -191,23 +465,42 @@
         <w:tc>
           <w:tcPr>
             <w:tcW w:type="dxa" w:w="2880"/>
+            <w:vAlign w:val="center"/>
           </w:tcPr>
-          <w:p/>
+          <w:p>
+            <w:pPr>
+              <w:jc w:val="center"/>
+            </w:pPr>
+          </w:p>
         </w:tc>
         <w:tc>
           <w:tcPr>
             <w:tcW w:type="dxa" w:w="2880"/>
+            <w:vAlign w:val="center"/>
           </w:tcPr>
-          <w:p/>
+          <w:p>
+            <w:pPr>
+              <w:jc w:val="center"/>
+            </w:pPr>
+          </w:p>
         </w:tc>
       </w:tr>
       <w:tr>
         <w:tc>
           <w:tcPr>
             <w:tcW w:type="dxa" w:w="2880"/>
+            <w:vAlign w:val="center"/>
           </w:tcPr>
           <w:p>
+            <w:pPr>
+              <w:jc w:val="center"/>
+            </w:pPr>
             <w:r>
+              <w:rPr>
+                <w:rFonts w:ascii="Times New Roman" w:hAnsi="Times New Roman" w:eastAsia="Times New Roman"/>
+                <w:b w:val="0"/>
+                <w:sz w:val="24"/>
+              </w:rPr>
               <w:t>{%tr if tables.A2.enabled %}</w:t>
             </w:r>
           </w:p>
@@ -215,23 +508,48 @@
         <w:tc>
           <w:tcPr>
             <w:tcW w:type="dxa" w:w="2880"/>
+            <w:vAlign w:val="center"/>
           </w:tcPr>
-          <w:p/>
+          <w:p>
+            <w:pPr>
+              <w:jc w:val="center"/>
+            </w:pPr>
+          </w:p>
         </w:tc>
         <w:tc>
           <w:tcPr>
             <w:tcW w:type="dxa" w:w="2880"/>
+            <w:vAlign w:val="center"/>
           </w:tcPr>
-          <w:p/>
+          <w:p>
+            <w:pPr>
+              <w:jc w:val="center"/>
+            </w:pPr>
+          </w:p>
         </w:tc>
       </w:tr>
       <w:tr>
         <w:tc>
           <w:tcPr>
             <w:tcW w:type="dxa" w:w="2880"/>
+            <w:vAlign w:val="center"/>
+            <w:tcBorders>
+              <w:top w:val="single" w:sz="4" w:space="0" w:color="000000"/>
+              <w:start w:val="single" w:sz="4" w:space="0" w:color="000000"/>
+              <w:bottom w:val="single" w:sz="4" w:space="0" w:color="000000"/>
+              <w:end w:val="single" w:sz="4" w:space="0" w:color="000000"/>
+            </w:tcBorders>
           </w:tcPr>
           <w:p>
+            <w:pPr>
+              <w:jc w:val="center"/>
+            </w:pPr>
             <w:r>
+              <w:rPr>
+                <w:rFonts w:ascii="Times New Roman" w:hAnsi="Times New Roman" w:eastAsia="Times New Roman"/>
+                <w:b w:val="0"/>
+                <w:sz w:val="24"/>
+              </w:rPr>
               <w:t>2.Xác định độ nhạy đầu vào kênh A</w:t>
             </w:r>
           </w:p>
@@ -239,9 +557,24 @@
         <w:tc>
           <w:tcPr>
             <w:tcW w:type="dxa" w:w="2880"/>
+            <w:vAlign w:val="center"/>
+            <w:tcBorders>
+              <w:top w:val="single" w:sz="4" w:space="0" w:color="000000"/>
+              <w:start w:val="single" w:sz="4" w:space="0" w:color="000000"/>
+              <w:bottom w:val="single" w:sz="4" w:space="0" w:color="000000"/>
+              <w:end w:val="single" w:sz="4" w:space="0" w:color="000000"/>
+            </w:tcBorders>
           </w:tcPr>
           <w:p>
+            <w:pPr>
+              <w:jc w:val="center"/>
+            </w:pPr>
             <w:r>
+              <w:rPr>
+                <w:rFonts w:ascii="Times New Roman" w:hAnsi="Times New Roman" w:eastAsia="Times New Roman"/>
+                <w:b w:val="0"/>
+                <w:sz w:val="24"/>
+              </w:rPr>
               <w:t>{{ tables.A2.result }}</w:t>
             </w:r>
           </w:p>
@@ -249,9 +582,24 @@
         <w:tc>
           <w:tcPr>
             <w:tcW w:type="dxa" w:w="2880"/>
+            <w:vAlign w:val="center"/>
+            <w:tcBorders>
+              <w:top w:val="single" w:sz="4" w:space="0" w:color="000000"/>
+              <w:start w:val="single" w:sz="4" w:space="0" w:color="000000"/>
+              <w:bottom w:val="single" w:sz="4" w:space="0" w:color="000000"/>
+              <w:end w:val="single" w:sz="4" w:space="0" w:color="000000"/>
+            </w:tcBorders>
           </w:tcPr>
           <w:p>
+            <w:pPr>
+              <w:jc w:val="center"/>
+            </w:pPr>
             <w:r>
+              <w:rPr>
+                <w:rFonts w:ascii="Times New Roman" w:hAnsi="Times New Roman" w:eastAsia="Times New Roman"/>
+                <w:b w:val="0"/>
+                <w:sz w:val="24"/>
+              </w:rPr>
               <w:t>Theo QTKĐ</w:t>
             </w:r>
           </w:p>
@@ -261,9 +609,18 @@
         <w:tc>
           <w:tcPr>
             <w:tcW w:type="dxa" w:w="2880"/>
+            <w:vAlign w:val="center"/>
           </w:tcPr>
           <w:p>
+            <w:pPr>
+              <w:jc w:val="center"/>
+            </w:pPr>
             <w:r>
+              <w:rPr>
+                <w:rFonts w:ascii="Times New Roman" w:hAnsi="Times New Roman" w:eastAsia="Times New Roman"/>
+                <w:b w:val="0"/>
+                <w:sz w:val="24"/>
+              </w:rPr>
               <w:t>{%tr endif %}</w:t>
             </w:r>
           </w:p>
@@ -271,23 +628,42 @@
         <w:tc>
           <w:tcPr>
             <w:tcW w:type="dxa" w:w="2880"/>
+            <w:vAlign w:val="center"/>
           </w:tcPr>
-          <w:p/>
+          <w:p>
+            <w:pPr>
+              <w:jc w:val="center"/>
+            </w:pPr>
+          </w:p>
         </w:tc>
         <w:tc>
           <w:tcPr>
             <w:tcW w:type="dxa" w:w="2880"/>
+            <w:vAlign w:val="center"/>
           </w:tcPr>
-          <w:p/>
+          <w:p>
+            <w:pPr>
+              <w:jc w:val="center"/>
+            </w:pPr>
+          </w:p>
         </w:tc>
       </w:tr>
       <w:tr>
         <w:tc>
           <w:tcPr>
             <w:tcW w:type="dxa" w:w="2880"/>
+            <w:vAlign w:val="center"/>
           </w:tcPr>
           <w:p>
+            <w:pPr>
+              <w:jc w:val="center"/>
+            </w:pPr>
             <w:r>
+              <w:rPr>
+                <w:rFonts w:ascii="Times New Roman" w:hAnsi="Times New Roman" w:eastAsia="Times New Roman"/>
+                <w:b w:val="0"/>
+                <w:sz w:val="24"/>
+              </w:rPr>
               <w:t>{%tr if tables.A3.enabled %}</w:t>
             </w:r>
           </w:p>
@@ -295,23 +671,48 @@
         <w:tc>
           <w:tcPr>
             <w:tcW w:type="dxa" w:w="2880"/>
+            <w:vAlign w:val="center"/>
           </w:tcPr>
-          <w:p/>
+          <w:p>
+            <w:pPr>
+              <w:jc w:val="center"/>
+            </w:pPr>
+          </w:p>
         </w:tc>
         <w:tc>
           <w:tcPr>
             <w:tcW w:type="dxa" w:w="2880"/>
+            <w:vAlign w:val="center"/>
           </w:tcPr>
-          <w:p/>
+          <w:p>
+            <w:pPr>
+              <w:jc w:val="center"/>
+            </w:pPr>
+          </w:p>
         </w:tc>
       </w:tr>
       <w:tr>
         <w:tc>
           <w:tcPr>
             <w:tcW w:type="dxa" w:w="2880"/>
+            <w:vAlign w:val="center"/>
+            <w:tcBorders>
+              <w:top w:val="single" w:sz="4" w:space="0" w:color="000000"/>
+              <w:start w:val="single" w:sz="4" w:space="0" w:color="000000"/>
+              <w:bottom w:val="single" w:sz="4" w:space="0" w:color="000000"/>
+              <w:end w:val="single" w:sz="4" w:space="0" w:color="000000"/>
+            </w:tcBorders>
           </w:tcPr>
           <w:p>
+            <w:pPr>
+              <w:jc w:val="center"/>
+            </w:pPr>
             <w:r>
+              <w:rPr>
+                <w:rFonts w:ascii="Times New Roman" w:hAnsi="Times New Roman" w:eastAsia="Times New Roman"/>
+                <w:b w:val="0"/>
+                <w:sz w:val="24"/>
+              </w:rPr>
               <w:t>3.Xác định độ nhạy đầu vào kênh B</w:t>
             </w:r>
           </w:p>
@@ -319,9 +720,24 @@
         <w:tc>
           <w:tcPr>
             <w:tcW w:type="dxa" w:w="2880"/>
+            <w:vAlign w:val="center"/>
+            <w:tcBorders>
+              <w:top w:val="single" w:sz="4" w:space="0" w:color="000000"/>
+              <w:start w:val="single" w:sz="4" w:space="0" w:color="000000"/>
+              <w:bottom w:val="single" w:sz="4" w:space="0" w:color="000000"/>
+              <w:end w:val="single" w:sz="4" w:space="0" w:color="000000"/>
+            </w:tcBorders>
           </w:tcPr>
           <w:p>
+            <w:pPr>
+              <w:jc w:val="center"/>
+            </w:pPr>
             <w:r>
+              <w:rPr>
+                <w:rFonts w:ascii="Times New Roman" w:hAnsi="Times New Roman" w:eastAsia="Times New Roman"/>
+                <w:b w:val="0"/>
+                <w:sz w:val="24"/>
+              </w:rPr>
               <w:t>{{ tables.A3.result }}</w:t>
             </w:r>
           </w:p>
@@ -329,9 +745,24 @@
         <w:tc>
           <w:tcPr>
             <w:tcW w:type="dxa" w:w="2880"/>
+            <w:vAlign w:val="center"/>
+            <w:tcBorders>
+              <w:top w:val="single" w:sz="4" w:space="0" w:color="000000"/>
+              <w:start w:val="single" w:sz="4" w:space="0" w:color="000000"/>
+              <w:bottom w:val="single" w:sz="4" w:space="0" w:color="000000"/>
+              <w:end w:val="single" w:sz="4" w:space="0" w:color="000000"/>
+            </w:tcBorders>
           </w:tcPr>
           <w:p>
+            <w:pPr>
+              <w:jc w:val="center"/>
+            </w:pPr>
             <w:r>
+              <w:rPr>
+                <w:rFonts w:ascii="Times New Roman" w:hAnsi="Times New Roman" w:eastAsia="Times New Roman"/>
+                <w:b w:val="0"/>
+                <w:sz w:val="24"/>
+              </w:rPr>
               <w:t>Theo QTKĐ</w:t>
             </w:r>
           </w:p>
@@ -341,9 +772,18 @@
         <w:tc>
           <w:tcPr>
             <w:tcW w:type="dxa" w:w="2880"/>
+            <w:vAlign w:val="center"/>
           </w:tcPr>
           <w:p>
+            <w:pPr>
+              <w:jc w:val="center"/>
+            </w:pPr>
             <w:r>
+              <w:rPr>
+                <w:rFonts w:ascii="Times New Roman" w:hAnsi="Times New Roman" w:eastAsia="Times New Roman"/>
+                <w:b w:val="0"/>
+                <w:sz w:val="24"/>
+              </w:rPr>
               <w:t>{%tr endif %}</w:t>
             </w:r>
           </w:p>
@@ -351,23 +791,42 @@
         <w:tc>
           <w:tcPr>
             <w:tcW w:type="dxa" w:w="2880"/>
+            <w:vAlign w:val="center"/>
           </w:tcPr>
-          <w:p/>
+          <w:p>
+            <w:pPr>
+              <w:jc w:val="center"/>
+            </w:pPr>
+          </w:p>
         </w:tc>
         <w:tc>
           <w:tcPr>
             <w:tcW w:type="dxa" w:w="2880"/>
+            <w:vAlign w:val="center"/>
           </w:tcPr>
-          <w:p/>
+          <w:p>
+            <w:pPr>
+              <w:jc w:val="center"/>
+            </w:pPr>
+          </w:p>
         </w:tc>
       </w:tr>
       <w:tr>
         <w:tc>
           <w:tcPr>
             <w:tcW w:type="dxa" w:w="2880"/>
+            <w:vAlign w:val="center"/>
           </w:tcPr>
           <w:p>
+            <w:pPr>
+              <w:jc w:val="center"/>
+            </w:pPr>
             <w:r>
+              <w:rPr>
+                <w:rFonts w:ascii="Times New Roman" w:hAnsi="Times New Roman" w:eastAsia="Times New Roman"/>
+                <w:b w:val="0"/>
+                <w:sz w:val="24"/>
+              </w:rPr>
               <w:t>{%tr if tables.A4.enabled %}</w:t>
             </w:r>
           </w:p>
@@ -375,23 +834,48 @@
         <w:tc>
           <w:tcPr>
             <w:tcW w:type="dxa" w:w="2880"/>
+            <w:vAlign w:val="center"/>
           </w:tcPr>
-          <w:p/>
+          <w:p>
+            <w:pPr>
+              <w:jc w:val="center"/>
+            </w:pPr>
+          </w:p>
         </w:tc>
         <w:tc>
           <w:tcPr>
             <w:tcW w:type="dxa" w:w="2880"/>
+            <w:vAlign w:val="center"/>
           </w:tcPr>
-          <w:p/>
+          <w:p>
+            <w:pPr>
+              <w:jc w:val="center"/>
+            </w:pPr>
+          </w:p>
         </w:tc>
       </w:tr>
       <w:tr>
         <w:tc>
           <w:tcPr>
             <w:tcW w:type="dxa" w:w="2880"/>
+            <w:vAlign w:val="center"/>
+            <w:tcBorders>
+              <w:top w:val="single" w:sz="4" w:space="0" w:color="000000"/>
+              <w:start w:val="single" w:sz="4" w:space="0" w:color="000000"/>
+              <w:bottom w:val="single" w:sz="4" w:space="0" w:color="000000"/>
+              <w:end w:val="single" w:sz="4" w:space="0" w:color="000000"/>
+            </w:tcBorders>
           </w:tcPr>
           <w:p>
+            <w:pPr>
+              <w:jc w:val="center"/>
+            </w:pPr>
             <w:r>
+              <w:rPr>
+                <w:rFonts w:ascii="Times New Roman" w:hAnsi="Times New Roman" w:eastAsia="Times New Roman"/>
+                <w:b w:val="0"/>
+                <w:sz w:val="24"/>
+              </w:rPr>
               <w:t>4.Xác định độ nhạy đầu vào kênh C</w:t>
             </w:r>
           </w:p>
@@ -399,9 +883,24 @@
         <w:tc>
           <w:tcPr>
             <w:tcW w:type="dxa" w:w="2880"/>
+            <w:vAlign w:val="center"/>
+            <w:tcBorders>
+              <w:top w:val="single" w:sz="4" w:space="0" w:color="000000"/>
+              <w:start w:val="single" w:sz="4" w:space="0" w:color="000000"/>
+              <w:bottom w:val="single" w:sz="4" w:space="0" w:color="000000"/>
+              <w:end w:val="single" w:sz="4" w:space="0" w:color="000000"/>
+            </w:tcBorders>
           </w:tcPr>
           <w:p>
+            <w:pPr>
+              <w:jc w:val="center"/>
+            </w:pPr>
             <w:r>
+              <w:rPr>
+                <w:rFonts w:ascii="Times New Roman" w:hAnsi="Times New Roman" w:eastAsia="Times New Roman"/>
+                <w:b w:val="0"/>
+                <w:sz w:val="24"/>
+              </w:rPr>
               <w:t>{{ tables.A4.result }}</w:t>
             </w:r>
           </w:p>
@@ -409,9 +908,24 @@
         <w:tc>
           <w:tcPr>
             <w:tcW w:type="dxa" w:w="2880"/>
+            <w:vAlign w:val="center"/>
+            <w:tcBorders>
+              <w:top w:val="single" w:sz="4" w:space="0" w:color="000000"/>
+              <w:start w:val="single" w:sz="4" w:space="0" w:color="000000"/>
+              <w:bottom w:val="single" w:sz="4" w:space="0" w:color="000000"/>
+              <w:end w:val="single" w:sz="4" w:space="0" w:color="000000"/>
+            </w:tcBorders>
           </w:tcPr>
           <w:p>
+            <w:pPr>
+              <w:jc w:val="center"/>
+            </w:pPr>
             <w:r>
+              <w:rPr>
+                <w:rFonts w:ascii="Times New Roman" w:hAnsi="Times New Roman" w:eastAsia="Times New Roman"/>
+                <w:b w:val="0"/>
+                <w:sz w:val="24"/>
+              </w:rPr>
               <w:t>Theo QTKĐ</w:t>
             </w:r>
           </w:p>
@@ -421,9 +935,18 @@
         <w:tc>
           <w:tcPr>
             <w:tcW w:type="dxa" w:w="2880"/>
+            <w:vAlign w:val="center"/>
           </w:tcPr>
           <w:p>
+            <w:pPr>
+              <w:jc w:val="center"/>
+            </w:pPr>
             <w:r>
+              <w:rPr>
+                <w:rFonts w:ascii="Times New Roman" w:hAnsi="Times New Roman" w:eastAsia="Times New Roman"/>
+                <w:b w:val="0"/>
+                <w:sz w:val="24"/>
+              </w:rPr>
               <w:t>{%tr endif %}</w:t>
             </w:r>
           </w:p>
@@ -431,23 +954,42 @@
         <w:tc>
           <w:tcPr>
             <w:tcW w:type="dxa" w:w="2880"/>
+            <w:vAlign w:val="center"/>
           </w:tcPr>
-          <w:p/>
+          <w:p>
+            <w:pPr>
+              <w:jc w:val="center"/>
+            </w:pPr>
+          </w:p>
         </w:tc>
         <w:tc>
           <w:tcPr>
             <w:tcW w:type="dxa" w:w="2880"/>
+            <w:vAlign w:val="center"/>
           </w:tcPr>
-          <w:p/>
+          <w:p>
+            <w:pPr>
+              <w:jc w:val="center"/>
+            </w:pPr>
+          </w:p>
         </w:tc>
       </w:tr>
       <w:tr>
         <w:tc>
           <w:tcPr>
             <w:tcW w:type="dxa" w:w="2880"/>
+            <w:vAlign w:val="center"/>
           </w:tcPr>
           <w:p>
+            <w:pPr>
+              <w:jc w:val="center"/>
+            </w:pPr>
             <w:r>
+              <w:rPr>
+                <w:rFonts w:ascii="Times New Roman" w:hAnsi="Times New Roman" w:eastAsia="Times New Roman"/>
+                <w:b w:val="0"/>
+                <w:sz w:val="24"/>
+              </w:rPr>
               <w:t>{%tr if tables.A5.enabled %}</w:t>
             </w:r>
           </w:p>
@@ -455,23 +997,48 @@
         <w:tc>
           <w:tcPr>
             <w:tcW w:type="dxa" w:w="2880"/>
+            <w:vAlign w:val="center"/>
           </w:tcPr>
-          <w:p/>
+          <w:p>
+            <w:pPr>
+              <w:jc w:val="center"/>
+            </w:pPr>
+          </w:p>
         </w:tc>
         <w:tc>
           <w:tcPr>
             <w:tcW w:type="dxa" w:w="2880"/>
+            <w:vAlign w:val="center"/>
           </w:tcPr>
-          <w:p/>
+          <w:p>
+            <w:pPr>
+              <w:jc w:val="center"/>
+            </w:pPr>
+          </w:p>
         </w:tc>
       </w:tr>
       <w:tr>
         <w:tc>
           <w:tcPr>
             <w:tcW w:type="dxa" w:w="2880"/>
+            <w:vAlign w:val="center"/>
+            <w:tcBorders>
+              <w:top w:val="single" w:sz="4" w:space="0" w:color="000000"/>
+              <w:start w:val="single" w:sz="4" w:space="0" w:color="000000"/>
+              <w:bottom w:val="single" w:sz="4" w:space="0" w:color="000000"/>
+              <w:end w:val="single" w:sz="4" w:space="0" w:color="000000"/>
+            </w:tcBorders>
           </w:tcPr>
           <w:p>
+            <w:pPr>
+              <w:jc w:val="center"/>
+            </w:pPr>
             <w:r>
+              <w:rPr>
+                <w:rFonts w:ascii="Times New Roman" w:hAnsi="Times New Roman" w:eastAsia="Times New Roman"/>
+                <w:b w:val="0"/>
+                <w:sz w:val="24"/>
+              </w:rPr>
               <w:t>5.Xác định sai số đo tần số kênh A</w:t>
             </w:r>
           </w:p>
@@ -479,9 +1046,24 @@
         <w:tc>
           <w:tcPr>
             <w:tcW w:type="dxa" w:w="2880"/>
+            <w:vAlign w:val="center"/>
+            <w:tcBorders>
+              <w:top w:val="single" w:sz="4" w:space="0" w:color="000000"/>
+              <w:start w:val="single" w:sz="4" w:space="0" w:color="000000"/>
+              <w:bottom w:val="single" w:sz="4" w:space="0" w:color="000000"/>
+              <w:end w:val="single" w:sz="4" w:space="0" w:color="000000"/>
+            </w:tcBorders>
           </w:tcPr>
           <w:p>
+            <w:pPr>
+              <w:jc w:val="center"/>
+            </w:pPr>
             <w:r>
+              <w:rPr>
+                <w:rFonts w:ascii="Times New Roman" w:hAnsi="Times New Roman" w:eastAsia="Times New Roman"/>
+                <w:b w:val="0"/>
+                <w:sz w:val="24"/>
+              </w:rPr>
               <w:t>{{ tables.A5.result }}</w:t>
             </w:r>
           </w:p>
@@ -489,9 +1071,24 @@
         <w:tc>
           <w:tcPr>
             <w:tcW w:type="dxa" w:w="2880"/>
+            <w:vAlign w:val="center"/>
+            <w:tcBorders>
+              <w:top w:val="single" w:sz="4" w:space="0" w:color="000000"/>
+              <w:start w:val="single" w:sz="4" w:space="0" w:color="000000"/>
+              <w:bottom w:val="single" w:sz="4" w:space="0" w:color="000000"/>
+              <w:end w:val="single" w:sz="4" w:space="0" w:color="000000"/>
+            </w:tcBorders>
           </w:tcPr>
           <w:p>
+            <w:pPr>
+              <w:jc w:val="center"/>
+            </w:pPr>
             <w:r>
+              <w:rPr>
+                <w:rFonts w:ascii="Times New Roman" w:hAnsi="Times New Roman" w:eastAsia="Times New Roman"/>
+                <w:b w:val="0"/>
+                <w:sz w:val="24"/>
+              </w:rPr>
               <w:t>± 2,4×10⁻⁷</w:t>
             </w:r>
           </w:p>
@@ -501,9 +1098,18 @@
         <w:tc>
           <w:tcPr>
             <w:tcW w:type="dxa" w:w="2880"/>
+            <w:vAlign w:val="center"/>
           </w:tcPr>
           <w:p>
+            <w:pPr>
+              <w:jc w:val="center"/>
+            </w:pPr>
             <w:r>
+              <w:rPr>
+                <w:rFonts w:ascii="Times New Roman" w:hAnsi="Times New Roman" w:eastAsia="Times New Roman"/>
+                <w:b w:val="0"/>
+                <w:sz w:val="24"/>
+              </w:rPr>
               <w:t>{%tr endif %}</w:t>
             </w:r>
           </w:p>
@@ -511,23 +1117,42 @@
         <w:tc>
           <w:tcPr>
             <w:tcW w:type="dxa" w:w="2880"/>
+            <w:vAlign w:val="center"/>
           </w:tcPr>
-          <w:p/>
+          <w:p>
+            <w:pPr>
+              <w:jc w:val="center"/>
+            </w:pPr>
+          </w:p>
         </w:tc>
         <w:tc>
           <w:tcPr>
             <w:tcW w:type="dxa" w:w="2880"/>
+            <w:vAlign w:val="center"/>
           </w:tcPr>
-          <w:p/>
+          <w:p>
+            <w:pPr>
+              <w:jc w:val="center"/>
+            </w:pPr>
+          </w:p>
         </w:tc>
       </w:tr>
       <w:tr>
         <w:tc>
           <w:tcPr>
             <w:tcW w:type="dxa" w:w="2880"/>
+            <w:vAlign w:val="center"/>
           </w:tcPr>
           <w:p>
+            <w:pPr>
+              <w:jc w:val="center"/>
+            </w:pPr>
             <w:r>
+              <w:rPr>
+                <w:rFonts w:ascii="Times New Roman" w:hAnsi="Times New Roman" w:eastAsia="Times New Roman"/>
+                <w:b w:val="0"/>
+                <w:sz w:val="24"/>
+              </w:rPr>
               <w:t>{%tr if tables.A6.enabled %}</w:t>
             </w:r>
           </w:p>
@@ -535,23 +1160,48 @@
         <w:tc>
           <w:tcPr>
             <w:tcW w:type="dxa" w:w="2880"/>
+            <w:vAlign w:val="center"/>
           </w:tcPr>
-          <w:p/>
+          <w:p>
+            <w:pPr>
+              <w:jc w:val="center"/>
+            </w:pPr>
+          </w:p>
         </w:tc>
         <w:tc>
           <w:tcPr>
             <w:tcW w:type="dxa" w:w="2880"/>
+            <w:vAlign w:val="center"/>
           </w:tcPr>
-          <w:p/>
+          <w:p>
+            <w:pPr>
+              <w:jc w:val="center"/>
+            </w:pPr>
+          </w:p>
         </w:tc>
       </w:tr>
       <w:tr>
         <w:tc>
           <w:tcPr>
             <w:tcW w:type="dxa" w:w="2880"/>
+            <w:vAlign w:val="center"/>
+            <w:tcBorders>
+              <w:top w:val="single" w:sz="4" w:space="0" w:color="000000"/>
+              <w:start w:val="single" w:sz="4" w:space="0" w:color="000000"/>
+              <w:bottom w:val="single" w:sz="4" w:space="0" w:color="000000"/>
+              <w:end w:val="single" w:sz="4" w:space="0" w:color="000000"/>
+            </w:tcBorders>
           </w:tcPr>
           <w:p>
+            <w:pPr>
+              <w:jc w:val="center"/>
+            </w:pPr>
             <w:r>
+              <w:rPr>
+                <w:rFonts w:ascii="Times New Roman" w:hAnsi="Times New Roman" w:eastAsia="Times New Roman"/>
+                <w:b w:val="0"/>
+                <w:sz w:val="24"/>
+              </w:rPr>
               <w:t>6.Xác định sai số đo tần số kênh B</w:t>
             </w:r>
           </w:p>
@@ -559,9 +1209,24 @@
         <w:tc>
           <w:tcPr>
             <w:tcW w:type="dxa" w:w="2880"/>
+            <w:vAlign w:val="center"/>
+            <w:tcBorders>
+              <w:top w:val="single" w:sz="4" w:space="0" w:color="000000"/>
+              <w:start w:val="single" w:sz="4" w:space="0" w:color="000000"/>
+              <w:bottom w:val="single" w:sz="4" w:space="0" w:color="000000"/>
+              <w:end w:val="single" w:sz="4" w:space="0" w:color="000000"/>
+            </w:tcBorders>
           </w:tcPr>
           <w:p>
+            <w:pPr>
+              <w:jc w:val="center"/>
+            </w:pPr>
             <w:r>
+              <w:rPr>
+                <w:rFonts w:ascii="Times New Roman" w:hAnsi="Times New Roman" w:eastAsia="Times New Roman"/>
+                <w:b w:val="0"/>
+                <w:sz w:val="24"/>
+              </w:rPr>
               <w:t>{{ tables.A6.result }}</w:t>
             </w:r>
           </w:p>
@@ -569,9 +1234,24 @@
         <w:tc>
           <w:tcPr>
             <w:tcW w:type="dxa" w:w="2880"/>
+            <w:vAlign w:val="center"/>
+            <w:tcBorders>
+              <w:top w:val="single" w:sz="4" w:space="0" w:color="000000"/>
+              <w:start w:val="single" w:sz="4" w:space="0" w:color="000000"/>
+              <w:bottom w:val="single" w:sz="4" w:space="0" w:color="000000"/>
+              <w:end w:val="single" w:sz="4" w:space="0" w:color="000000"/>
+            </w:tcBorders>
           </w:tcPr>
           <w:p>
+            <w:pPr>
+              <w:jc w:val="center"/>
+            </w:pPr>
             <w:r>
+              <w:rPr>
+                <w:rFonts w:ascii="Times New Roman" w:hAnsi="Times New Roman" w:eastAsia="Times New Roman"/>
+                <w:b w:val="0"/>
+                <w:sz w:val="24"/>
+              </w:rPr>
               <w:t>± 2,4×10⁻⁷</w:t>
             </w:r>
           </w:p>
@@ -581,9 +1261,18 @@
         <w:tc>
           <w:tcPr>
             <w:tcW w:type="dxa" w:w="2880"/>
+            <w:vAlign w:val="center"/>
           </w:tcPr>
           <w:p>
+            <w:pPr>
+              <w:jc w:val="center"/>
+            </w:pPr>
             <w:r>
+              <w:rPr>
+                <w:rFonts w:ascii="Times New Roman" w:hAnsi="Times New Roman" w:eastAsia="Times New Roman"/>
+                <w:b w:val="0"/>
+                <w:sz w:val="24"/>
+              </w:rPr>
               <w:t>{%tr endif %}</w:t>
             </w:r>
           </w:p>
@@ -591,23 +1280,42 @@
         <w:tc>
           <w:tcPr>
             <w:tcW w:type="dxa" w:w="2880"/>
+            <w:vAlign w:val="center"/>
           </w:tcPr>
-          <w:p/>
+          <w:p>
+            <w:pPr>
+              <w:jc w:val="center"/>
+            </w:pPr>
+          </w:p>
         </w:tc>
         <w:tc>
           <w:tcPr>
             <w:tcW w:type="dxa" w:w="2880"/>
+            <w:vAlign w:val="center"/>
           </w:tcPr>
-          <w:p/>
+          <w:p>
+            <w:pPr>
+              <w:jc w:val="center"/>
+            </w:pPr>
+          </w:p>
         </w:tc>
       </w:tr>
       <w:tr>
         <w:tc>
           <w:tcPr>
             <w:tcW w:type="dxa" w:w="2880"/>
+            <w:vAlign w:val="center"/>
           </w:tcPr>
           <w:p>
+            <w:pPr>
+              <w:jc w:val="center"/>
+            </w:pPr>
             <w:r>
+              <w:rPr>
+                <w:rFonts w:ascii="Times New Roman" w:hAnsi="Times New Roman" w:eastAsia="Times New Roman"/>
+                <w:b w:val="0"/>
+                <w:sz w:val="24"/>
+              </w:rPr>
               <w:t>{%tr if tables.A7.enabled %}</w:t>
             </w:r>
           </w:p>
@@ -615,23 +1323,48 @@
         <w:tc>
           <w:tcPr>
             <w:tcW w:type="dxa" w:w="2880"/>
+            <w:vAlign w:val="center"/>
           </w:tcPr>
-          <w:p/>
+          <w:p>
+            <w:pPr>
+              <w:jc w:val="center"/>
+            </w:pPr>
+          </w:p>
         </w:tc>
         <w:tc>
           <w:tcPr>
             <w:tcW w:type="dxa" w:w="2880"/>
+            <w:vAlign w:val="center"/>
           </w:tcPr>
-          <w:p/>
+          <w:p>
+            <w:pPr>
+              <w:jc w:val="center"/>
+            </w:pPr>
+          </w:p>
         </w:tc>
       </w:tr>
       <w:tr>
         <w:tc>
           <w:tcPr>
             <w:tcW w:type="dxa" w:w="2880"/>
+            <w:vAlign w:val="center"/>
+            <w:tcBorders>
+              <w:top w:val="single" w:sz="4" w:space="0" w:color="000000"/>
+              <w:start w:val="single" w:sz="4" w:space="0" w:color="000000"/>
+              <w:bottom w:val="single" w:sz="4" w:space="0" w:color="000000"/>
+              <w:end w:val="single" w:sz="4" w:space="0" w:color="000000"/>
+            </w:tcBorders>
           </w:tcPr>
           <w:p>
+            <w:pPr>
+              <w:jc w:val="center"/>
+            </w:pPr>
             <w:r>
+              <w:rPr>
+                <w:rFonts w:ascii="Times New Roman" w:hAnsi="Times New Roman" w:eastAsia="Times New Roman"/>
+                <w:b w:val="0"/>
+                <w:sz w:val="24"/>
+              </w:rPr>
               <w:t>7.Xác định sai số đo tần số kênh C</w:t>
             </w:r>
           </w:p>
@@ -639,9 +1372,24 @@
         <w:tc>
           <w:tcPr>
             <w:tcW w:type="dxa" w:w="2880"/>
+            <w:vAlign w:val="center"/>
+            <w:tcBorders>
+              <w:top w:val="single" w:sz="4" w:space="0" w:color="000000"/>
+              <w:start w:val="single" w:sz="4" w:space="0" w:color="000000"/>
+              <w:bottom w:val="single" w:sz="4" w:space="0" w:color="000000"/>
+              <w:end w:val="single" w:sz="4" w:space="0" w:color="000000"/>
+            </w:tcBorders>
           </w:tcPr>
           <w:p>
+            <w:pPr>
+              <w:jc w:val="center"/>
+            </w:pPr>
             <w:r>
+              <w:rPr>
+                <w:rFonts w:ascii="Times New Roman" w:hAnsi="Times New Roman" w:eastAsia="Times New Roman"/>
+                <w:b w:val="0"/>
+                <w:sz w:val="24"/>
+              </w:rPr>
               <w:t>{{ tables.A7.result }}</w:t>
             </w:r>
           </w:p>
@@ -649,9 +1397,24 @@
         <w:tc>
           <w:tcPr>
             <w:tcW w:type="dxa" w:w="2880"/>
+            <w:vAlign w:val="center"/>
+            <w:tcBorders>
+              <w:top w:val="single" w:sz="4" w:space="0" w:color="000000"/>
+              <w:start w:val="single" w:sz="4" w:space="0" w:color="000000"/>
+              <w:bottom w:val="single" w:sz="4" w:space="0" w:color="000000"/>
+              <w:end w:val="single" w:sz="4" w:space="0" w:color="000000"/>
+            </w:tcBorders>
           </w:tcPr>
           <w:p>
+            <w:pPr>
+              <w:jc w:val="center"/>
+            </w:pPr>
             <w:r>
+              <w:rPr>
+                <w:rFonts w:ascii="Times New Roman" w:hAnsi="Times New Roman" w:eastAsia="Times New Roman"/>
+                <w:b w:val="0"/>
+                <w:sz w:val="24"/>
+              </w:rPr>
               <w:t>± 2,4×10⁻⁷</w:t>
             </w:r>
           </w:p>
@@ -661,9 +1424,18 @@
         <w:tc>
           <w:tcPr>
             <w:tcW w:type="dxa" w:w="2880"/>
+            <w:vAlign w:val="center"/>
           </w:tcPr>
           <w:p>
+            <w:pPr>
+              <w:jc w:val="center"/>
+            </w:pPr>
             <w:r>
+              <w:rPr>
+                <w:rFonts w:ascii="Times New Roman" w:hAnsi="Times New Roman" w:eastAsia="Times New Roman"/>
+                <w:b w:val="0"/>
+                <w:sz w:val="24"/>
+              </w:rPr>
               <w:t>{%tr endif %}</w:t>
             </w:r>
           </w:p>
@@ -671,23 +1443,42 @@
         <w:tc>
           <w:tcPr>
             <w:tcW w:type="dxa" w:w="2880"/>
+            <w:vAlign w:val="center"/>
           </w:tcPr>
-          <w:p/>
+          <w:p>
+            <w:pPr>
+              <w:jc w:val="center"/>
+            </w:pPr>
+          </w:p>
         </w:tc>
         <w:tc>
           <w:tcPr>
             <w:tcW w:type="dxa" w:w="2880"/>
+            <w:vAlign w:val="center"/>
           </w:tcPr>
-          <w:p/>
+          <w:p>
+            <w:pPr>
+              <w:jc w:val="center"/>
+            </w:pPr>
+          </w:p>
         </w:tc>
       </w:tr>
       <w:tr>
         <w:tc>
           <w:tcPr>
             <w:tcW w:type="dxa" w:w="2880"/>
+            <w:vAlign w:val="center"/>
           </w:tcPr>
           <w:p>
+            <w:pPr>
+              <w:jc w:val="center"/>
+            </w:pPr>
             <w:r>
+              <w:rPr>
+                <w:rFonts w:ascii="Times New Roman" w:hAnsi="Times New Roman" w:eastAsia="Times New Roman"/>
+                <w:b w:val="0"/>
+                <w:sz w:val="24"/>
+              </w:rPr>
               <w:t>{%tr if tables.A8.enabled %}</w:t>
             </w:r>
           </w:p>
@@ -695,23 +1486,48 @@
         <w:tc>
           <w:tcPr>
             <w:tcW w:type="dxa" w:w="2880"/>
+            <w:vAlign w:val="center"/>
           </w:tcPr>
-          <w:p/>
+          <w:p>
+            <w:pPr>
+              <w:jc w:val="center"/>
+            </w:pPr>
+          </w:p>
         </w:tc>
         <w:tc>
           <w:tcPr>
             <w:tcW w:type="dxa" w:w="2880"/>
+            <w:vAlign w:val="center"/>
           </w:tcPr>
-          <w:p/>
+          <w:p>
+            <w:pPr>
+              <w:jc w:val="center"/>
+            </w:pPr>
+          </w:p>
         </w:tc>
       </w:tr>
       <w:tr>
         <w:tc>
           <w:tcPr>
             <w:tcW w:type="dxa" w:w="2880"/>
+            <w:vAlign w:val="center"/>
+            <w:tcBorders>
+              <w:top w:val="single" w:sz="4" w:space="0" w:color="000000"/>
+              <w:start w:val="single" w:sz="4" w:space="0" w:color="000000"/>
+              <w:bottom w:val="single" w:sz="4" w:space="0" w:color="000000"/>
+              <w:end w:val="single" w:sz="4" w:space="0" w:color="000000"/>
+            </w:tcBorders>
           </w:tcPr>
           <w:p>
+            <w:pPr>
+              <w:jc w:val="center"/>
+            </w:pPr>
             <w:r>
+              <w:rPr>
+                <w:rFonts w:ascii="Times New Roman" w:hAnsi="Times New Roman" w:eastAsia="Times New Roman"/>
+                <w:b w:val="0"/>
+                <w:sz w:val="24"/>
+              </w:rPr>
               <w:t>8.Xác định sai số đo chu kỳ</w:t>
             </w:r>
           </w:p>
@@ -719,9 +1535,24 @@
         <w:tc>
           <w:tcPr>
             <w:tcW w:type="dxa" w:w="2880"/>
+            <w:vAlign w:val="center"/>
+            <w:tcBorders>
+              <w:top w:val="single" w:sz="4" w:space="0" w:color="000000"/>
+              <w:start w:val="single" w:sz="4" w:space="0" w:color="000000"/>
+              <w:bottom w:val="single" w:sz="4" w:space="0" w:color="000000"/>
+              <w:end w:val="single" w:sz="4" w:space="0" w:color="000000"/>
+            </w:tcBorders>
           </w:tcPr>
           <w:p>
+            <w:pPr>
+              <w:jc w:val="center"/>
+            </w:pPr>
             <w:r>
+              <w:rPr>
+                <w:rFonts w:ascii="Times New Roman" w:hAnsi="Times New Roman" w:eastAsia="Times New Roman"/>
+                <w:b w:val="0"/>
+                <w:sz w:val="24"/>
+              </w:rPr>
               <w:t>{{ tables.A8.result }}</w:t>
             </w:r>
           </w:p>
@@ -729,9 +1560,24 @@
         <w:tc>
           <w:tcPr>
             <w:tcW w:type="dxa" w:w="2880"/>
+            <w:vAlign w:val="center"/>
+            <w:tcBorders>
+              <w:top w:val="single" w:sz="4" w:space="0" w:color="000000"/>
+              <w:start w:val="single" w:sz="4" w:space="0" w:color="000000"/>
+              <w:bottom w:val="single" w:sz="4" w:space="0" w:color="000000"/>
+              <w:end w:val="single" w:sz="4" w:space="0" w:color="000000"/>
+            </w:tcBorders>
           </w:tcPr>
           <w:p>
+            <w:pPr>
+              <w:jc w:val="center"/>
+            </w:pPr>
             <w:r>
+              <w:rPr>
+                <w:rFonts w:ascii="Times New Roman" w:hAnsi="Times New Roman" w:eastAsia="Times New Roman"/>
+                <w:b w:val="0"/>
+                <w:sz w:val="24"/>
+              </w:rPr>
               <w:t>± 2,4×10⁻⁷</w:t>
             </w:r>
           </w:p>
@@ -741,9 +1587,18 @@
         <w:tc>
           <w:tcPr>
             <w:tcW w:type="dxa" w:w="2880"/>
+            <w:vAlign w:val="center"/>
           </w:tcPr>
           <w:p>
+            <w:pPr>
+              <w:jc w:val="center"/>
+            </w:pPr>
             <w:r>
+              <w:rPr>
+                <w:rFonts w:ascii="Times New Roman" w:hAnsi="Times New Roman" w:eastAsia="Times New Roman"/>
+                <w:b w:val="0"/>
+                <w:sz w:val="24"/>
+              </w:rPr>
               <w:t>{%tr endif %}</w:t>
             </w:r>
           </w:p>
@@ -751,30 +1606,70 @@
         <w:tc>
           <w:tcPr>
             <w:tcW w:type="dxa" w:w="2880"/>
+            <w:vAlign w:val="center"/>
           </w:tcPr>
-          <w:p/>
+          <w:p>
+            <w:pPr>
+              <w:jc w:val="center"/>
+            </w:pPr>
+          </w:p>
         </w:tc>
         <w:tc>
           <w:tcPr>
             <w:tcW w:type="dxa" w:w="2880"/>
+            <w:vAlign w:val="center"/>
           </w:tcPr>
-          <w:p/>
+          <w:p>
+            <w:pPr>
+              <w:jc w:val="center"/>
+            </w:pPr>
+          </w:p>
         </w:tc>
       </w:tr>
     </w:tbl>
     <w:p>
       <w:r>
+        <w:rPr>
+          <w:rFonts w:ascii="Times New Roman" w:hAnsi="Times New Roman" w:eastAsia="Times New Roman"/>
+          <w:sz w:val="26"/>
+        </w:rPr>
         <w:t>Phương pháp kiểm định: QTKĐ 2.461 : 2018</w:t>
       </w:r>
     </w:p>
     <w:p>
       <w:r>
-        <w:t>Kết luận: {{ header.conclusion }}</w:t>
+        <w:rPr>
+          <w:rFonts w:ascii="Times New Roman" w:hAnsi="Times New Roman" w:eastAsia="Times New Roman"/>
+          <w:b/>
+          <w:sz w:val="26"/>
+        </w:rPr>
+        <w:t xml:space="preserve">Kết luận: </w:t>
+      </w:r>
+      <w:r>
+        <w:rPr>
+          <w:rFonts w:ascii="Times New Roman" w:hAnsi="Times New Roman" w:eastAsia="Times New Roman"/>
+          <w:b w:val="0"/>
+          <w:sz w:val="26"/>
+        </w:rPr>
+        <w:t>{{ header.conclusion }}</w:t>
       </w:r>
     </w:p>
     <w:p>
       <w:r>
-        <w:t>Hiệu lực đến {{ header.expire }}</w:t>
+        <w:rPr>
+          <w:rFonts w:ascii="Times New Roman" w:hAnsi="Times New Roman" w:eastAsia="Times New Roman"/>
+          <w:b/>
+          <w:sz w:val="26"/>
+        </w:rPr>
+        <w:t xml:space="preserve">Hiệu lực đến </w:t>
+      </w:r>
+      <w:r>
+        <w:rPr>
+          <w:rFonts w:ascii="Times New Roman" w:hAnsi="Times New Roman" w:eastAsia="Times New Roman"/>
+          <w:b w:val="0"/>
+          <w:sz w:val="26"/>
+        </w:rPr>
+        <w:t>{{ header.expire }}</w:t>
       </w:r>
     </w:p>
     <w:tbl>
@@ -791,14 +1686,33 @@
         <w:tc>
           <w:tcPr>
             <w:tcW w:type="dxa" w:w="4320"/>
+            <w:vAlign w:val="center"/>
           </w:tcPr>
           <w:p>
+            <w:pPr>
+              <w:spacing w:before="40"/>
+              <w:jc w:val="center"/>
+            </w:pPr>
             <w:r>
+              <w:rPr>
+                <w:rFonts w:ascii="Times New Roman" w:hAnsi="Times New Roman" w:eastAsia="Times New Roman"/>
+                <w:b/>
+                <w:sz w:val="26"/>
+              </w:rPr>
               <w:t>Người kiểm soát</w:t>
             </w:r>
           </w:p>
           <w:p>
+            <w:pPr>
+              <w:spacing w:before="40"/>
+              <w:jc w:val="center"/>
+            </w:pPr>
             <w:r>
+              <w:rPr>
+                <w:rFonts w:ascii="Times New Roman" w:hAnsi="Times New Roman" w:eastAsia="Times New Roman"/>
+                <w:b/>
+                <w:sz w:val="26"/>
+              </w:rPr>
               <w:t>(Chữ ký, họ tên)</w:t>
             </w:r>
           </w:p>
@@ -806,14 +1720,33 @@
         <w:tc>
           <w:tcPr>
             <w:tcW w:type="dxa" w:w="4320"/>
+            <w:vAlign w:val="center"/>
           </w:tcPr>
           <w:p>
+            <w:pPr>
+              <w:spacing w:before="40"/>
+              <w:jc w:val="center"/>
+            </w:pPr>
             <w:r>
+              <w:rPr>
+                <w:rFonts w:ascii="Times New Roman" w:hAnsi="Times New Roman" w:eastAsia="Times New Roman"/>
+                <w:b/>
+                <w:sz w:val="26"/>
+              </w:rPr>
               <w:t>Kiểm định viên</w:t>
             </w:r>
           </w:p>
           <w:p>
+            <w:pPr>
+              <w:spacing w:before="40"/>
+              <w:jc w:val="center"/>
+            </w:pPr>
             <w:r>
+              <w:rPr>
+                <w:rFonts w:ascii="Times New Roman" w:hAnsi="Times New Roman" w:eastAsia="Times New Roman"/>
+                <w:b/>
+                <w:sz w:val="26"/>
+              </w:rPr>
               <w:t>(Chữ ký, họ tên)</w:t>
             </w:r>
           </w:p>
@@ -821,19 +1754,47 @@
         <w:tc>
           <w:tcPr>
             <w:tcW w:type="dxa" w:w="4320"/>
+            <w:vAlign w:val="center"/>
           </w:tcPr>
           <w:p>
+            <w:pPr>
+              <w:spacing w:before="40"/>
+              <w:jc w:val="center"/>
+            </w:pPr>
             <w:r>
+              <w:rPr>
+                <w:rFonts w:ascii="Times New Roman" w:hAnsi="Times New Roman" w:eastAsia="Times New Roman"/>
+                <w:b/>
+                <w:sz w:val="26"/>
+              </w:rPr>
               <w:t>THỦ TRƯỞNG ĐƠN VỊ</w:t>
             </w:r>
           </w:p>
           <w:p>
+            <w:pPr>
+              <w:spacing w:before="40"/>
+              <w:jc w:val="center"/>
+            </w:pPr>
             <w:r>
+              <w:rPr>
+                <w:rFonts w:ascii="Times New Roman" w:hAnsi="Times New Roman" w:eastAsia="Times New Roman"/>
+                <w:b/>
+                <w:sz w:val="26"/>
+              </w:rPr>
               <w:t>(Ký tên, đóng dấu)</w:t>
             </w:r>
           </w:p>
           <w:p>
+            <w:pPr>
+              <w:spacing w:before="40"/>
+              <w:jc w:val="center"/>
+            </w:pPr>
             <w:r>
+              <w:rPr>
+                <w:rFonts w:ascii="Times New Roman" w:hAnsi="Times New Roman" w:eastAsia="Times New Roman"/>
+                <w:b w:val="0"/>
+                <w:sz w:val="26"/>
+              </w:rPr>
               <w:t>{{ header.manager }}</w:t>
             </w:r>
           </w:p>
@@ -842,6 +1803,10 @@
     </w:tbl>
     <w:p>
       <w:r>
+        <w:rPr>
+          <w:rFonts w:ascii="Times New Roman" w:hAnsi="Times New Roman" w:eastAsia="Times New Roman"/>
+          <w:sz w:val="26"/>
+        </w:rPr>
         <w:t>(*) Với điều kiện tôn trọng các nguyên tắc sử dụng và bảo quản                    Tổng số trang:………</w:t>
       </w:r>
     </w:p>
@@ -1218,6 +2183,10 @@
     <w:name w:val="Normal"/>
     <w:qFormat/>
     <w:rsid w:val="00FC693F"/>
+    <w:rPr>
+      <w:rFonts w:ascii="Times New Roman" w:hAnsi="Times New Roman" w:eastAsia="Times New Roman"/>
+      <w:sz w:val="26"/>
+    </w:rPr>
   </w:style>
   <w:style w:type="paragraph" w:styleId="Header">
     <w:name w:val="header"/>

</xml_diff>